<commit_message>
Corrige la Seccion 6.4 del IEEE para que coincida con la evidencia
El documento citaba cifras y un extracto de log de una corrida anterior
que ya no existia en el repositorio: decia 19 items duplicados y 11
operaciones sin cambio, cuando la evidencia versionada registra 102
eventos, 8 duplicados y 8 operaciones sin cambio.

Ademas afirmaba que dos productores escribian en la misma posicion, lo
que no ocurre en el log commiteado (se verifico: cero casos de escrituras
consecutivas a la misma posicion sin consumo intermedio). Esa afirmacion
se elimina y se sustituye por las dos anomalias que si estan en el log:
un consumo que deja la ocupacion sin variar (decremento perdido) y un
consumo tras el cual la ocupacion sube (incremento intercalado).

Ahora toda cifra del apartado se puede contrastar contra
evidencia/carrera_explicada.txt y evidencia/log_version_a.txt.

Co-Authored-By: Claude Opus 5 <noreply@anthropic.com>
</commit_message>
<xml_diff>
--- a/proyecto2-concurrencia/docs/Proyecto2_ProductorConsumidor_IEEE.docx
+++ b/proyecto2-concurrencia/docs/Proyecto2_ProductorConsumidor_IEEE.docx
@@ -15932,7 +15932,7 @@
           <w:sz w:val="14"/>
           <w:szCs w:val="14"/>
         </w:rPr>
-        <w:t xml:space="preserve">0.3494  P0  PROD  1000006    7   1   4-&gt;5</w:t>
+        <w:t xml:space="preserve">0.3162  P1  PROD  2000008    9   3   2-&gt;3</w:t>
       </w:r>
     </w:p>
     <w:p>
@@ -15947,7 +15947,7 @@
           <w:sz w:val="14"/>
           <w:szCs w:val="14"/>
         </w:rPr>
-        <w:t xml:space="preserve">0.3495  P1  PROD  2000001    2   1   4-&gt;6</w:t>
+        <w:t xml:space="preserve">0.3162  P1  PROD  2000009   10   4   3-&gt;4</w:t>
       </w:r>
     </w:p>
     <w:p>
@@ -15962,7 +15962,7 @@
           <w:sz w:val="14"/>
           <w:szCs w:val="14"/>
         </w:rPr>
-        <w:t xml:space="preserve">0.3496  C0  CONS  1000004    5   4   5-&gt;5   &lt;&lt;&lt;</w:t>
+        <w:t xml:space="preserve">0.3163  C0  CONS  2000007    8   2   3-&gt;3  &lt;&lt;&lt;</w:t>
       </w:r>
     </w:p>
     <w:p>
@@ -15977,13 +15977,13 @@
           <w:sz w:val="14"/>
           <w:szCs w:val="14"/>
         </w:rPr>
-        <w:t xml:space="preserve">0.3497  C0  CONS  2000000    1   0   5-&gt;4</w:t>
+        <w:t xml:space="preserve">0.3164  P1  PROD  2000010   11   0   3-&gt;4</w:t>
       </w:r>
     </w:p>
     <w:p>
       <w:pPr>
         <w:shd w:fill="F2F2F2" w:val="clear"/>
-        <w:spacing w:after="0" w:line="235"/>
+        <w:spacing w:after="150" w:line="235"/>
         <w:ind w:left="280"/>
       </w:pPr>
       <w:r>
@@ -15992,22 +15992,7 @@
           <w:sz w:val="14"/>
           <w:szCs w:val="14"/>
         </w:rPr>
-        <w:t xml:space="preserve">...</w:t>
-      </w:r>
-    </w:p>
-    <w:p>
-      <w:pPr>
-        <w:shd w:fill="F2F2F2" w:val="clear"/>
-        <w:spacing w:after="150" w:line="235"/>
-        <w:ind w:left="280"/>
-      </w:pPr>
-      <w:r>
-        <w:rPr>
-          <w:rFonts w:ascii="Consolas" w:cs="Consolas" w:eastAsia="Consolas" w:hAnsi="Consolas"/>
-          <w:sz w:val="14"/>
-          <w:szCs w:val="14"/>
-        </w:rPr>
-        <w:t xml:space="preserve">0.3504  C0  CONS  1000004    5   4   5-&gt;4   &lt;&lt;&lt;</w:t>
+        <w:t xml:space="preserve">0.3164  C0  CONS  2000008    9   3   3-&gt;2</w:t>
       </w:r>
     </w:p>
     <w:p>
@@ -16025,7 +16010,7 @@
           <w:sz w:val="19"/>
           <w:szCs w:val="19"/>
         </w:rPr>
-        <w:t xml:space="preserve">Tres hechos independientes son visibles en este fragmento. El primero: los productores P0 y P1 escriben ambos en la posición 1 en instantes consecutivos, de modo que el segundo sobrescribe al primero y ese ítem se pierde. El segundo: la operación marcada a los 0.3496 ms es un consumo tras el cual la ocupación permanece en 5; el decremento se perdió porque otro hilo leyó el mismo valor del contador, operó sobre él y una de las dos escrituras pisó a la otra.</w:t>
+        <w:t xml:space="preserve">La operacion marcada es un consumo tras el cual la ocupacion permanece en 3: el decremento se perdio por completo. Otro hilo leyo el mismo valor del contador, opero sobre el, y una de las dos escrituras piso a la otra. Este es el mecanismo elemental descrito en la Seccion 3.1, capturado en ejecucion.</w:t>
       </w:r>
     </w:p>
     <w:p>
@@ -16043,7 +16028,112 @@
           <w:sz w:val="19"/>
           <w:szCs w:val="19"/>
         </w:rPr>
-        <w:t xml:space="preserve">El tercero es consecuencia del segundo. Los decrementos perdidos dejan el contador de ocupación por encima del valor real. Los consumidores creen entonces que hay datos disponibles cuando el buffer ya se vació, avanzan el índice de lectura dando la vuelta al anillo y vuelven a leer una posición que ningún productor ha sobrescrito todavía: el ítem 1000004 se entrega por segunda vez desde la misma posición 4. Ese es el mecanismo por el cual la suma de los valores consumidos llega a superar a la de los producidos, como muestra la Tabla 4. No se inventan ítems: algunos se contabilizan dos veces.</w:t>
+        <w:t xml:space="preserve">El segundo extracto muestra la consecuencia de esas perdidas acumuladas.</w:t>
+      </w:r>
+    </w:p>
+    <w:p>
+      <w:pPr>
+        <w:shd w:fill="F2F2F2" w:val="clear"/>
+        <w:spacing w:after="0" w:line="235"/>
+        <w:ind w:left="280"/>
+      </w:pPr>
+      <w:r>
+        <w:rPr>
+          <w:rFonts w:ascii="Consolas" w:cs="Consolas" w:eastAsia="Consolas" w:hAnsi="Consolas"/>
+          <w:sz w:val="14"/>
+          <w:szCs w:val="14"/>
+        </w:rPr>
+        <w:t xml:space="preserve">0.3138  P1  PROD  2000005    6   0   4-&gt;5</w:t>
+      </w:r>
+    </w:p>
+    <w:p>
+      <w:pPr>
+        <w:shd w:fill="F2F2F2" w:val="clear"/>
+        <w:spacing w:after="0" w:line="235"/>
+        <w:ind w:left="280"/>
+      </w:pPr>
+      <w:r>
+        <w:rPr>
+          <w:rFonts w:ascii="Consolas" w:cs="Consolas" w:eastAsia="Consolas" w:hAnsi="Consolas"/>
+          <w:sz w:val="14"/>
+          <w:szCs w:val="14"/>
+        </w:rPr>
+        <w:t xml:space="preserve">0.3139  C0  CONS  2000001    2   1   4-&gt;3  &lt;&lt;&lt;</w:t>
+      </w:r>
+    </w:p>
+    <w:p>
+      <w:pPr>
+        <w:shd w:fill="F2F2F2" w:val="clear"/>
+        <w:spacing w:after="0" w:line="235"/>
+        <w:ind w:left="280"/>
+      </w:pPr>
+      <w:r>
+        <w:rPr>
+          <w:rFonts w:ascii="Consolas" w:cs="Consolas" w:eastAsia="Consolas" w:hAnsi="Consolas"/>
+          <w:sz w:val="14"/>
+          <w:szCs w:val="14"/>
+        </w:rPr>
+        <w:t xml:space="preserve">0.3140  C0  CONS  2000002    3   2   3-&gt;4</w:t>
+      </w:r>
+    </w:p>
+    <w:p>
+      <w:pPr>
+        <w:shd w:fill="F2F2F2" w:val="clear"/>
+        <w:spacing w:after="0" w:line="235"/>
+        <w:ind w:left="280"/>
+      </w:pPr>
+      <w:r>
+        <w:rPr>
+          <w:rFonts w:ascii="Consolas" w:cs="Consolas" w:eastAsia="Consolas" w:hAnsi="Consolas"/>
+          <w:sz w:val="14"/>
+          <w:szCs w:val="14"/>
+        </w:rPr>
+        <w:t xml:space="preserve">0.3140  C0  CONS  2000003    4   3   4-&gt;3</w:t>
+      </w:r>
+    </w:p>
+    <w:p>
+      <w:pPr>
+        <w:shd w:fill="F2F2F2" w:val="clear"/>
+        <w:spacing w:after="0" w:line="235"/>
+        <w:ind w:left="280"/>
+      </w:pPr>
+      <w:r>
+        <w:rPr>
+          <w:rFonts w:ascii="Consolas" w:cs="Consolas" w:eastAsia="Consolas" w:hAnsi="Consolas"/>
+          <w:sz w:val="14"/>
+          <w:szCs w:val="14"/>
+        </w:rPr>
+        <w:t xml:space="preserve">0.3141  C0  CONS  2000004    5   4   3-&gt;2</w:t>
+      </w:r>
+    </w:p>
+    <w:p>
+      <w:pPr>
+        <w:shd w:fill="F2F2F2" w:val="clear"/>
+        <w:spacing w:after="0" w:line="235"/>
+        <w:ind w:left="280"/>
+      </w:pPr>
+      <w:r>
+        <w:rPr>
+          <w:rFonts w:ascii="Consolas" w:cs="Consolas" w:eastAsia="Consolas" w:hAnsi="Consolas"/>
+          <w:sz w:val="14"/>
+          <w:szCs w:val="14"/>
+        </w:rPr>
+        <w:t xml:space="preserve">0.3141  C0  CONS  2000005    6   0   2-&gt;1</w:t>
+      </w:r>
+    </w:p>
+    <w:p>
+      <w:pPr>
+        <w:shd w:fill="F2F2F2" w:val="clear"/>
+        <w:spacing w:after="150" w:line="235"/>
+        <w:ind w:left="280"/>
+      </w:pPr>
+      <w:r>
+        <w:rPr>
+          <w:rFonts w:ascii="Consolas" w:cs="Consolas" w:eastAsia="Consolas" w:hAnsi="Consolas"/>
+          <w:sz w:val="14"/>
+          <w:szCs w:val="14"/>
+        </w:rPr>
+        <w:t xml:space="preserve">0.3142  C0  CONS  2000001    2   1   1-&gt;0  &lt;&lt;&lt;</w:t>
       </w:r>
     </w:p>
     <w:p>
@@ -16061,7 +16151,43 @@
           <w:sz w:val="19"/>
           <w:szCs w:val="19"/>
         </w:rPr>
-        <w:t xml:space="preserve">En la corrida completa de la que procede el extracto se registraron 19 ítems consumidos más de una vez y 11 operaciones tras las cuales la ocupación no varió. El log completo y su análisis quedan versionados en el directorio de evidencia.</w:t>
+        <w:t xml:space="preserve">Dos anomalías son visibles aquí, además de la duplicación. La primera está en la línea marcada a los 0.3139 ms y la de los 0.3142 ms: el mismo ítem, con identificador 2000001 y valor 2, se entrega dos veces a un consumidor, ambas desde la posición 1 del buffer. La segunda está en la línea de los 0.3140 ms, donde un consumo hace que la ocupación observada suba de 3 a 4: el incremento de un productor concurrente se intercaló entre la lectura y la escritura del contador por parte del consumidor.</w:t>
+      </w:r>
+    </w:p>
+    <w:p>
+      <w:pPr>
+        <w:spacing w:after="110" w:line="250"/>
+        <w:jc w:val="both"/>
+      </w:pPr>
+      <w:r>
+        <w:rPr>
+          <w:rFonts w:ascii="Times New Roman" w:cs="Times New Roman" w:eastAsia="Times New Roman" w:hAnsi="Times New Roman"/>
+          <w:b w:val="false"/>
+          <w:bCs w:val="false"/>
+          <w:i w:val="false"/>
+          <w:iCs w:val="false"/>
+          <w:sz w:val="19"/>
+          <w:szCs w:val="19"/>
+        </w:rPr>
+        <w:t xml:space="preserve">La cadena causal que une ambos extractos es la siguiente. Los decrementos perdidos dejan el contador de ocupación por encima del valor real, de modo que los consumidores creen que hay datos disponibles cuando el buffer ya se vació. Avanzan entonces el índice de lectura dando la vuelta al anillo y releen una posición que ningún productor ha sobrescrito todavía, con lo que el ítem antiguo se entrega por segunda vez. Ese es el mecanismo por el cual la suma de los valores consumidos llega a superar a la de los producidos, como muestran las Tablas 4 a 7: no se inventan ítems, algunos se contabilizan dos veces.</w:t>
+      </w:r>
+    </w:p>
+    <w:p>
+      <w:pPr>
+        <w:spacing w:after="110" w:line="250"/>
+        <w:jc w:val="both"/>
+      </w:pPr>
+      <w:r>
+        <w:rPr>
+          <w:rFonts w:ascii="Times New Roman" w:cs="Times New Roman" w:eastAsia="Times New Roman" w:hAnsi="Times New Roman"/>
+          <w:b w:val="false"/>
+          <w:bCs w:val="false"/>
+          <w:i w:val="false"/>
+          <w:iCs w:val="false"/>
+          <w:sz w:val="19"/>
+          <w:szCs w:val="19"/>
+        </w:rPr>
+        <w:t xml:space="preserve">La corrida completa de la que proceden ambos extractos registró 102 eventos, de los cuales 8 ítems fueron consumidos más de una vez y 8 operaciones dejaron la ocupación sin variar. El log íntegro y el análisis que localiza estos casos quedan versionados en el directorio de evidencia, de modo que las cifras de este apartado se pueden regenerar y contrastar contra el registro crudo.</w:t>
       </w:r>
     </w:p>
     <w:p>

</xml_diff>